<commit_message>
Live FISCO settlement on the V2 contracts (front running fixed on the live path, 24 of 24), public RPC behind a secret path with a method allowlist, 353 of 353 receipts, documents regenerated
</commit_message>
<xml_diff>
--- a/docs/Zishi_Execution_Evidence.docx
+++ b/docs/Zishi_Execution_Evidence.docx
@@ -189,7 +189,7 @@
         <w:rPr>
           <w:sz w:val="20"/>
         </w:rPr>
-        <w:t>The engine itself settles each job's money on the deployed contracts on FISCO BCOS in one loop: 16 contract calls plus 10 funding transfers to fresh role wallets, 26 of 26 transactions successful (fee locked in JobBoard, confirmed and split, instalments through Lease.pay, the rogue intent slashed by proof from the vendor bond, the title moved to the pilot).</w:t>
+        <w:t>The engine itself settles each job's money on the deployed contracts on FISCO BCOS in one loop, on the front running fix (IntentLogV2, BondV2): 14 contract calls plus 10 funding transfers to fresh role wallets, 24 of 24 transactions successful (fee locked in JobBoard, confirmed and split, instalments through Lease.pay, the rogue intent committed by its own agent and slashed by proof from the vendor bond, the title moved to the pilot).</w:t>
       </w:r>
     </w:p>
     <w:p>
@@ -1755,7 +1755,7 @@
           <w:b/>
           <w:sz w:val="20"/>
         </w:rPr>
-        <w:t>The engine's own run settling on the FISCO contracts.</w:t>
+        <w:t>The engine's own run settling on the FISCO contracts (V2 set).</w:t>
       </w:r>
     </w:p>
     <w:tbl>
@@ -1881,7 +1881,7 @@
               <w:rPr>
                 <w:sz w:val="16"/>
               </w:rPr>
-              <w:t>Bond.postVendorBond 5000 yuan (penalty 200, daily cap 1000)</w:t>
+              <w:t>BondV2.postVendorBond 5000 yuan (penalty 200, daily cap 1000)</w:t>
             </w:r>
           </w:p>
         </w:tc>
@@ -1908,7 +1908,7 @@
                 <w:rFonts w:ascii="Menlo" w:hAnsi="Menlo"/>
                 <w:sz w:val="17"/>
               </w:rPr>
-              <w:t>0x4fa1fe6ba62647e95d3779c279a1240b80a8f37c3d29d9816516c19748949061</w:t>
+              <w:t>0x4cbb150ce77ce59fcb1f46416786a053c0d7b3f1de6f1990c572e4a1f63909e1</w:t>
             </w:r>
           </w:p>
         </w:tc>
@@ -1921,7 +1921,7 @@
               <w:rPr>
                 <w:sz w:val="16"/>
               </w:rPr>
-              <w:t>356</w:t>
+              <w:t>650</w:t>
             </w:r>
           </w:p>
         </w:tc>
@@ -1962,7 +1962,7 @@
               <w:rPr>
                 <w:sz w:val="16"/>
               </w:rPr>
-              <w:t>Bond.register agent (operator pilot, allowlist lender)</w:t>
+              <w:t>BondV2.register agent (operator pilot, allowlist lender)</w:t>
             </w:r>
           </w:p>
         </w:tc>
@@ -1989,7 +1989,7 @@
                 <w:rFonts w:ascii="Menlo" w:hAnsi="Menlo"/>
                 <w:sz w:val="17"/>
               </w:rPr>
-              <w:t>0x0ea83a6b58a4951a71b3439aaab82cbf25b17215f98366e0ffc892a2ed69c1d0</w:t>
+              <w:t>0xcea5df9d7f7b11167703b093dc74ebd07c62e59e81e866d4bd4f389c0b4f6539</w:t>
             </w:r>
           </w:p>
         </w:tc>
@@ -2002,7 +2002,7 @@
               <w:rPr>
                 <w:sz w:val="16"/>
               </w:rPr>
-              <w:t>357</w:t>
+              <w:t>651</w:t>
             </w:r>
           </w:p>
         </w:tc>
@@ -2070,7 +2070,7 @@
                 <w:rFonts w:ascii="Menlo" w:hAnsi="Menlo"/>
                 <w:sz w:val="17"/>
               </w:rPr>
-              <w:t>0xdac40ca8d38ee768e0553eb238ad8f82f6ffb05469ea2f7f8b45887d0f93b251</w:t>
+              <w:t>0x2ac6006b1e69bf56feb967a8b85b2cd7d380b7fa5dcfe4cb53fbb0de11cc6a17</w:t>
             </w:r>
           </w:p>
         </w:tc>
@@ -2083,7 +2083,7 @@
               <w:rPr>
                 <w:sz w:val="16"/>
               </w:rPr>
-              <w:t>358</w:t>
+              <w:t>652</w:t>
             </w:r>
           </w:p>
         </w:tc>
@@ -2151,7 +2151,7 @@
                 <w:rFonts w:ascii="Menlo" w:hAnsi="Menlo"/>
                 <w:sz w:val="17"/>
               </w:rPr>
-              <w:t>0x8290fe7f0606a82a44da4e45f69dc1ccf2e10d32f585527b0f2f5e9425221e8d</w:t>
+              <w:t>0x3e8eb8f5fe39b6be107dfef165094bf679cf3417ed5eddc82a39d7b715380f4a</w:t>
             </w:r>
           </w:p>
         </w:tc>
@@ -2164,7 +2164,7 @@
               <w:rPr>
                 <w:sz w:val="16"/>
               </w:rPr>
-              <w:t>360</w:t>
+              <w:t>654</w:t>
             </w:r>
           </w:p>
         </w:tc>
@@ -2232,7 +2232,7 @@
                 <w:rFonts w:ascii="Menlo" w:hAnsi="Menlo"/>
                 <w:sz w:val="17"/>
               </w:rPr>
-              <w:t>0x52d096bc2447a4724adc5f5d0e90980cd7616eaa44b25a814c1e742119bf77e2</w:t>
+              <w:t>0xafe1456060735677c3aeb227dbec7527b3b5c9156e54d0c0f16e0544500c522f</w:t>
             </w:r>
           </w:p>
         </w:tc>
@@ -2245,7 +2245,7 @@
               <w:rPr>
                 <w:sz w:val="16"/>
               </w:rPr>
-              <w:t>363</w:t>
+              <w:t>657</w:t>
             </w:r>
           </w:p>
         </w:tc>
@@ -2313,7 +2313,7 @@
                 <w:rFonts w:ascii="Menlo" w:hAnsi="Menlo"/>
                 <w:sz w:val="17"/>
               </w:rPr>
-              <w:t>0x9a3de560fb42eaf606b65c366c8968476068b5565c4b594155fd621b080ca616</w:t>
+              <w:t>0xc088e8c6ba53695cf01a818403a665a152ed54962efb7c2d8a13be4c7294641f</w:t>
             </w:r>
           </w:p>
         </w:tc>
@@ -2326,7 +2326,7 @@
               <w:rPr>
                 <w:sz w:val="16"/>
               </w:rPr>
-              <w:t>365</w:t>
+              <w:t>659</w:t>
             </w:r>
           </w:p>
         </w:tc>
@@ -2394,7 +2394,7 @@
                 <w:rFonts w:ascii="Menlo" w:hAnsi="Menlo"/>
                 <w:sz w:val="17"/>
               </w:rPr>
-              <w:t>0x00b238d18dde985a67f1ca8f8905f7c47f21c873fccf1a9ddab100f710f1c858</w:t>
+              <w:t>0x98553f767728525b2663657727eb24c5fafb3354f4dbe977ba1dd3d94ade90b8</w:t>
             </w:r>
           </w:p>
         </w:tc>
@@ -2407,7 +2407,7 @@
               <w:rPr>
                 <w:sz w:val="16"/>
               </w:rPr>
-              <w:t>367</w:t>
+              <w:t>661</w:t>
             </w:r>
           </w:p>
         </w:tc>
@@ -2475,7 +2475,7 @@
                 <w:rFonts w:ascii="Menlo" w:hAnsi="Menlo"/>
                 <w:sz w:val="17"/>
               </w:rPr>
-              <w:t>0x88d910ab7b18863bd06aa6fef7ed8efbabbe9331b2f2c029b43ee1fb92cd3670</w:t>
+              <w:t>0x740f4f65a629c23bf64db23049a2654215816ff0fa5a3d36cedbe8a4e23ce8ab</w:t>
             </w:r>
           </w:p>
         </w:tc>
@@ -2488,7 +2488,7 @@
               <w:rPr>
                 <w:sz w:val="16"/>
               </w:rPr>
-              <w:t>370</w:t>
+              <w:t>664</w:t>
             </w:r>
           </w:p>
         </w:tc>
@@ -2556,7 +2556,7 @@
                 <w:rFonts w:ascii="Menlo" w:hAnsi="Menlo"/>
                 <w:sz w:val="17"/>
               </w:rPr>
-              <w:t>0x8e0af1d67fb9119240e2dbf930288f89c815762b891480529e8bfb5190984fe3</w:t>
+              <w:t>0xb73e9f330d77a39c912d9980b72771701fb2db991b32e726cde7f2e6648ddad3</w:t>
             </w:r>
           </w:p>
         </w:tc>
@@ -2569,7 +2569,7 @@
               <w:rPr>
                 <w:sz w:val="16"/>
               </w:rPr>
-              <w:t>371</w:t>
+              <w:t>666</w:t>
             </w:r>
           </w:p>
         </w:tc>
@@ -2610,7 +2610,7 @@
               <w:rPr>
                 <w:sz w:val="16"/>
               </w:rPr>
-              <w:t>IntentLog.commit rogue intent 0xb6922a51 for job-203</w:t>
+              <w:t>IntentLogV2.commit rogue intent 0xa38b7e12 for job-203</w:t>
             </w:r>
           </w:p>
         </w:tc>
@@ -2637,7 +2637,7 @@
                 <w:rFonts w:ascii="Menlo" w:hAnsi="Menlo"/>
                 <w:sz w:val="17"/>
               </w:rPr>
-              <w:t>0x5a3417870f46e04f4758dc4725abfae8a81e57f621298903e5907366a4f0753a</w:t>
+              <w:t>0xaa9b839d6bc369d870008888a4e220320b7d329a2c5eb291882549b859fbda32</w:t>
             </w:r>
           </w:p>
         </w:tc>
@@ -2650,7 +2650,7 @@
               <w:rPr>
                 <w:sz w:val="16"/>
               </w:rPr>
-              <w:t>374</w:t>
+              <w:t>669</w:t>
             </w:r>
           </w:p>
         </w:tc>
@@ -2691,7 +2691,7 @@
               <w:rPr>
                 <w:sz w:val="16"/>
               </w:rPr>
-              <w:t>Bond.slashByProof PayeeNotAllowlisted, vendor bond pays the treasury</w:t>
+              <w:t>BondV2.slashByProof PayeeNotAllowlisted, vendor bond pays the treasury</w:t>
             </w:r>
           </w:p>
         </w:tc>
@@ -2718,7 +2718,7 @@
                 <w:rFonts w:ascii="Menlo" w:hAnsi="Menlo"/>
                 <w:sz w:val="17"/>
               </w:rPr>
-              <w:t>0x7c45ed8475744947092cc10ea29a67dd0804ee5e044ec3ea934280264d34cfc4</w:t>
+              <w:t>0xc78373ada4fd6de20bef9a4366c23335527f552466f198e79bcfd4b03ed438ed</w:t>
             </w:r>
           </w:p>
         </w:tc>
@@ -2731,7 +2731,7 @@
               <w:rPr>
                 <w:sz w:val="16"/>
               </w:rPr>
-              <w:t>375</w:t>
+              <w:t>670</w:t>
             </w:r>
           </w:p>
         </w:tc>
@@ -2799,7 +2799,7 @@
                 <w:rFonts w:ascii="Menlo" w:hAnsi="Menlo"/>
                 <w:sz w:val="17"/>
               </w:rPr>
-              <w:t>0xe8a76e841dda7eae5b3de3447b62c78276d35ab149ad4e3671db4e962ba92cdc</w:t>
+              <w:t>0xa6dd514ae1dbbfb27ef3828970e4765caa1fc86e5d94d03a4d4530e157574909</w:t>
             </w:r>
           </w:p>
         </w:tc>
@@ -2812,7 +2812,7 @@
               <w:rPr>
                 <w:sz w:val="16"/>
               </w:rPr>
-              <w:t>377</w:t>
+              <w:t>672</w:t>
             </w:r>
           </w:p>
         </w:tc>
@@ -2880,7 +2880,7 @@
                 <w:rFonts w:ascii="Menlo" w:hAnsi="Menlo"/>
                 <w:sz w:val="17"/>
               </w:rPr>
-              <w:t>0xe585feb799618566b38b56ac3f39fa437e40ad4489976dac2462ae3e67999392</w:t>
+              <w:t>0xddfb7e912a12a8c96525e0eb26bb63dc3e32543c4333d61702266b4cbdfaf98b</w:t>
             </w:r>
           </w:p>
         </w:tc>
@@ -2893,7 +2893,7 @@
               <w:rPr>
                 <w:sz w:val="16"/>
               </w:rPr>
-              <w:t>379</w:t>
+              <w:t>673</w:t>
             </w:r>
           </w:p>
         </w:tc>
@@ -2961,7 +2961,7 @@
                 <w:rFonts w:ascii="Menlo" w:hAnsi="Menlo"/>
                 <w:sz w:val="17"/>
               </w:rPr>
-              <w:t>0xe6767e521b4dc04e5b2380ed68e9d752a846fdeebc7c34d5f3e1cfbef637b719</w:t>
+              <w:t>0xb70eff028acc46da9f979134a10b6db958597ae7a427cc29b6e6cbe6127e8966</w:t>
             </w:r>
           </w:p>
         </w:tc>
@@ -2974,169 +2974,7 @@
               <w:rPr>
                 <w:sz w:val="16"/>
               </w:rPr>
-              <w:t>381</w:t>
-            </w:r>
-          </w:p>
-        </w:tc>
-        <w:tc>
-          <w:tcPr>
-            <w:tcW w:type="dxa" w:w="1646"/>
-          </w:tcPr>
-          <w:p>
-            <w:r>
-              <w:rPr>
-                <w:sz w:val="16"/>
-              </w:rPr>
-              <w:t>success</w:t>
-            </w:r>
-          </w:p>
-        </w:tc>
-      </w:tr>
-      <w:tr>
-        <w:tc>
-          <w:tcPr>
-            <w:tcW w:type="dxa" w:w="1646"/>
-          </w:tcPr>
-          <w:p>
-            <w:r>
-              <w:rPr>
-                <w:sz w:val="16"/>
-              </w:rPr>
-              <w:t>hold job-203 released</w:t>
-            </w:r>
-          </w:p>
-        </w:tc>
-        <w:tc>
-          <w:tcPr>
-            <w:tcW w:type="dxa" w:w="1646"/>
-          </w:tcPr>
-          <w:p>
-            <w:r>
-              <w:rPr>
-                <w:sz w:val="16"/>
-              </w:rPr>
-              <w:t>JobBoard.releaseHold job-203</w:t>
-            </w:r>
-          </w:p>
-        </w:tc>
-        <w:tc>
-          <w:tcPr>
-            <w:tcW w:type="dxa" w:w="1646"/>
-          </w:tcPr>
-          <w:p>
-            <w:r>
-              <w:rPr>
-                <w:sz w:val="16"/>
-              </w:rPr>
-              <w:t>0</w:t>
-            </w:r>
-          </w:p>
-        </w:tc>
-        <w:tc>
-          <w:tcPr>
-            <w:tcW w:type="dxa" w:w="1646"/>
-          </w:tcPr>
-          <w:p>
-            <w:r>
-              <w:rPr>
-                <w:rFonts w:ascii="Menlo" w:hAnsi="Menlo"/>
-                <w:sz w:val="17"/>
-              </w:rPr>
-              <w:t>0x9aca2251c6706e71aef1862ef6925a55aed2b71b586797d70848f836825a67a0</w:t>
-            </w:r>
-          </w:p>
-        </w:tc>
-        <w:tc>
-          <w:tcPr>
-            <w:tcW w:type="dxa" w:w="1646"/>
-          </w:tcPr>
-          <w:p>
-            <w:r>
-              <w:rPr>
-                <w:sz w:val="16"/>
-              </w:rPr>
-              <w:t>383</w:t>
-            </w:r>
-          </w:p>
-        </w:tc>
-        <w:tc>
-          <w:tcPr>
-            <w:tcW w:type="dxa" w:w="1646"/>
-          </w:tcPr>
-          <w:p>
-            <w:r>
-              <w:rPr>
-                <w:sz w:val="16"/>
-              </w:rPr>
-              <w:t>success</w:t>
-            </w:r>
-          </w:p>
-        </w:tc>
-      </w:tr>
-      <w:tr>
-        <w:tc>
-          <w:tcPr>
-            <w:tcW w:type="dxa" w:w="1646"/>
-          </w:tcPr>
-          <w:p>
-            <w:r>
-              <w:rPr>
-                <w:sz w:val="16"/>
-              </w:rPr>
-              <w:t>hold job-201 released</w:t>
-            </w:r>
-          </w:p>
-        </w:tc>
-        <w:tc>
-          <w:tcPr>
-            <w:tcW w:type="dxa" w:w="1646"/>
-          </w:tcPr>
-          <w:p>
-            <w:r>
-              <w:rPr>
-                <w:sz w:val="16"/>
-              </w:rPr>
-              <w:t>JobBoard.releaseHold job-201</w:t>
-            </w:r>
-          </w:p>
-        </w:tc>
-        <w:tc>
-          <w:tcPr>
-            <w:tcW w:type="dxa" w:w="1646"/>
-          </w:tcPr>
-          <w:p>
-            <w:r>
-              <w:rPr>
-                <w:sz w:val="16"/>
-              </w:rPr>
-              <w:t>0</w:t>
-            </w:r>
-          </w:p>
-        </w:tc>
-        <w:tc>
-          <w:tcPr>
-            <w:tcW w:type="dxa" w:w="1646"/>
-          </w:tcPr>
-          <w:p>
-            <w:r>
-              <w:rPr>
-                <w:rFonts w:ascii="Menlo" w:hAnsi="Menlo"/>
-                <w:sz w:val="17"/>
-              </w:rPr>
-              <w:t>0x8d65df330815922f0820b6cc40986121456dd74c91f13f7bc6098635edbe1f37</w:t>
-            </w:r>
-          </w:p>
-        </w:tc>
-        <w:tc>
-          <w:tcPr>
-            <w:tcW w:type="dxa" w:w="1646"/>
-          </w:tcPr>
-          <w:p>
-            <w:r>
-              <w:rPr>
-                <w:sz w:val="16"/>
-              </w:rPr>
-              <w:t>384</w:t>
+              <w:t>675</w:t>
             </w:r>
           </w:p>
         </w:tc>
@@ -3785,7 +3623,7 @@
               <w:rPr>
                 <w:sz w:val="16"/>
               </w:rPr>
-              <w:t>2026-10-20T13:50:56.828Z</w:t>
+              <w:t>2026-10-20T14:31:27.555Z</w:t>
             </w:r>
           </w:p>
         </w:tc>
@@ -3798,7 +3636,7 @@
               <w:rPr>
                 <w:sz w:val="16"/>
               </w:rPr>
-              <w:t>Engine fleet run settling on FISCO with the free model reading offers</w:t>
+              <w:t>Engine fleet run settling on the V2 contracts on FISCO with the free model reading offers</w:t>
             </w:r>
           </w:p>
         </w:tc>
@@ -3811,7 +3649,7 @@
               <w:rPr>
                 <w:sz w:val="16"/>
               </w:rPr>
-              <w:t>26 of 26 successful, all balance checks passed</w:t>
+              <w:t>24 of 24 successful, all balance checks passed</w:t>
             </w:r>
           </w:p>
         </w:tc>
@@ -3825,7 +3663,7 @@
                 <w:rFonts w:ascii="Menlo" w:hAnsi="Menlo"/>
                 <w:sz w:val="17"/>
               </w:rPr>
-              <w:t>settled-run-2026-10-20T13-50-56-827Z.json</w:t>
+              <w:t>settled-run-2026-10-20T14-31-27-555Z.json</w:t>
             </w:r>
           </w:p>
         </w:tc>

</xml_diff>